<commit_message>
build(parcialLabProg1): Cálculo amostral e adição ao doc oficial.
</commit_message>
<xml_diff>
--- a/MFIX-OFC.docx
+++ b/MFIX-OFC.docx
@@ -246,15 +246,7 @@
           <w:b/>
           <w:sz w:val="36"/>
         </w:rPr>
-        <w:t>MFIX FIXADORES</w:t>
-      </w:r>
-      <w:r>
-        <w:rPr>
-          <w:rFonts w:ascii="Arial"/>
-          <w:b/>
-          <w:sz w:val="36"/>
-        </w:rPr>
-        <w:t xml:space="preserve"> Projeto</w:t>
+        <w:t>MFIX FIXADORES Projeto</w:t>
       </w:r>
       <w:r>
         <w:rPr>
@@ -397,21 +389,7 @@
           <w:sz w:val="31"/>
           <w:szCs w:val="31"/>
         </w:rPr>
-        <w:t>Bárbara</w:t>
-      </w:r>
-      <w:r>
-        <w:rPr>
-          <w:sz w:val="31"/>
-          <w:szCs w:val="31"/>
-        </w:rPr>
-        <w:t xml:space="preserve"> </w:t>
-      </w:r>
-      <w:r>
-        <w:rPr>
-          <w:sz w:val="31"/>
-          <w:szCs w:val="31"/>
-        </w:rPr>
-        <w:t>de Carvalho - 2041382511031</w:t>
+        <w:t>Bárbara de Carvalho - 2041382511031</w:t>
       </w:r>
     </w:p>
     <w:p>
@@ -19122,229 +19100,313 @@
     </w:p>
     <w:p>
       <w:pPr>
-        <w:pStyle w:val="Corpodetexto"/>
-        <w:spacing w:before="66" w:line="249" w:lineRule="auto"/>
-        <w:ind w:left="360"/>
+        <w:pStyle w:val="Ttulo4"/>
+        <w:tabs>
+          <w:tab w:val="left" w:pos="699"/>
+        </w:tabs>
+        <w:ind w:left="699" w:firstLine="0"/>
+        <w:rPr>
+          <w:sz w:val="24"/>
+          <w:szCs w:val="24"/>
+        </w:rPr>
       </w:pPr>
-      <w:r>
-        <w:rPr>
-          <w:color w:val="0000FF"/>
-        </w:rPr>
-        <w:t>[Esta</w:t>
-      </w:r>
-      <w:r>
-        <w:rPr>
-          <w:color w:val="0000FF"/>
-          <w:spacing w:val="31"/>
-        </w:rPr>
-        <w:t xml:space="preserve"> </w:t>
-      </w:r>
-      <w:r>
-        <w:rPr>
-          <w:color w:val="0000FF"/>
-        </w:rPr>
-        <w:t>seção</w:t>
-      </w:r>
-      <w:r>
-        <w:rPr>
-          <w:color w:val="0000FF"/>
-          <w:spacing w:val="31"/>
-        </w:rPr>
-        <w:t xml:space="preserve"> </w:t>
-      </w:r>
-      <w:r>
-        <w:rPr>
-          <w:color w:val="0000FF"/>
-        </w:rPr>
-        <w:t>apresenta</w:t>
-      </w:r>
-      <w:r>
-        <w:rPr>
-          <w:color w:val="0000FF"/>
-          <w:spacing w:val="26"/>
-        </w:rPr>
-        <w:t xml:space="preserve"> </w:t>
-      </w:r>
-      <w:r>
-        <w:rPr>
-          <w:color w:val="0000FF"/>
-        </w:rPr>
-        <w:t>os</w:t>
-      </w:r>
-      <w:r>
-        <w:rPr>
-          <w:color w:val="0000FF"/>
-          <w:spacing w:val="28"/>
-        </w:rPr>
-        <w:t xml:space="preserve"> </w:t>
-      </w:r>
-      <w:r>
-        <w:rPr>
-          <w:color w:val="0000FF"/>
-        </w:rPr>
-        <w:t>artefatos</w:t>
-      </w:r>
-      <w:r>
-        <w:rPr>
-          <w:color w:val="0000FF"/>
-          <w:spacing w:val="28"/>
-        </w:rPr>
-        <w:t xml:space="preserve"> </w:t>
-      </w:r>
-      <w:r>
-        <w:rPr>
-          <w:color w:val="0000FF"/>
-        </w:rPr>
-        <w:t>relativos</w:t>
-      </w:r>
-      <w:r>
-        <w:rPr>
-          <w:color w:val="0000FF"/>
-          <w:spacing w:val="33"/>
-        </w:rPr>
-        <w:t xml:space="preserve"> </w:t>
-      </w:r>
-      <w:r>
-        <w:rPr>
-          <w:color w:val="0000FF"/>
-        </w:rPr>
-        <w:t>às</w:t>
-      </w:r>
-      <w:r>
-        <w:rPr>
-          <w:color w:val="0000FF"/>
-          <w:spacing w:val="33"/>
-        </w:rPr>
-        <w:t xml:space="preserve"> </w:t>
-      </w:r>
-      <w:r>
-        <w:rPr>
-          <w:color w:val="0000FF"/>
-        </w:rPr>
-        <w:t>soluções</w:t>
-      </w:r>
-      <w:r>
-        <w:rPr>
-          <w:color w:val="0000FF"/>
-          <w:spacing w:val="36"/>
-        </w:rPr>
-        <w:t xml:space="preserve"> </w:t>
-      </w:r>
-      <w:r>
-        <w:rPr>
-          <w:color w:val="0000FF"/>
-        </w:rPr>
-        <w:t>de</w:t>
-      </w:r>
-      <w:r>
-        <w:rPr>
-          <w:color w:val="0000FF"/>
-          <w:spacing w:val="28"/>
-        </w:rPr>
-        <w:t xml:space="preserve"> </w:t>
-      </w:r>
-      <w:r>
-        <w:rPr>
-          <w:color w:val="0000FF"/>
-        </w:rPr>
-        <w:t>Laboratório</w:t>
-      </w:r>
-      <w:r>
-        <w:rPr>
-          <w:color w:val="0000FF"/>
-          <w:spacing w:val="31"/>
-        </w:rPr>
-        <w:t xml:space="preserve"> </w:t>
-      </w:r>
-      <w:r>
-        <w:rPr>
-          <w:color w:val="0000FF"/>
-        </w:rPr>
-        <w:t>de</w:t>
-      </w:r>
-      <w:r>
-        <w:rPr>
-          <w:color w:val="0000FF"/>
-          <w:spacing w:val="32"/>
-        </w:rPr>
-        <w:t xml:space="preserve"> </w:t>
-      </w:r>
-      <w:r>
-        <w:rPr>
-          <w:color w:val="0000FF"/>
-        </w:rPr>
-        <w:t>Programação</w:t>
-      </w:r>
-      <w:r>
-        <w:rPr>
-          <w:color w:val="0000FF"/>
-          <w:spacing w:val="26"/>
-        </w:rPr>
-        <w:t xml:space="preserve"> </w:t>
-      </w:r>
-      <w:r>
-        <w:rPr>
-          <w:color w:val="0000FF"/>
-        </w:rPr>
-        <w:t>I,</w:t>
-      </w:r>
-      <w:r>
-        <w:rPr>
-          <w:color w:val="0000FF"/>
-          <w:spacing w:val="32"/>
-        </w:rPr>
-        <w:t xml:space="preserve"> </w:t>
-      </w:r>
-      <w:r>
-        <w:rPr>
-          <w:color w:val="0000FF"/>
-        </w:rPr>
-        <w:t>de</w:t>
-      </w:r>
-      <w:r>
-        <w:rPr>
-          <w:color w:val="0000FF"/>
-          <w:spacing w:val="32"/>
-        </w:rPr>
-        <w:t xml:space="preserve"> </w:t>
-      </w:r>
-      <w:r>
-        <w:rPr>
-          <w:color w:val="0000FF"/>
-        </w:rPr>
-        <w:t>acordo,</w:t>
-      </w:r>
-      <w:r>
-        <w:rPr>
-          <w:color w:val="0000FF"/>
-          <w:spacing w:val="26"/>
-        </w:rPr>
-        <w:t xml:space="preserve"> </w:t>
-      </w:r>
-      <w:r>
-        <w:rPr>
-          <w:color w:val="0000FF"/>
-        </w:rPr>
-        <w:t>com</w:t>
-      </w:r>
-      <w:r>
-        <w:rPr>
-          <w:color w:val="0000FF"/>
-          <w:spacing w:val="32"/>
-        </w:rPr>
-        <w:t xml:space="preserve"> </w:t>
-      </w:r>
-      <w:r>
-        <w:rPr>
-          <w:color w:val="0000FF"/>
-        </w:rPr>
-        <w:t>os requisitos definidos no item 4. Disciplina de Apoio: Laboratório de Programação I].</w:t>
-      </w:r>
     </w:p>
     <w:p>
       <w:pPr>
-        <w:pStyle w:val="Corpodetexto"/>
+        <w:pStyle w:val="NormalWeb"/>
+        <w:spacing w:before="0" w:beforeAutospacing="0" w:after="120" w:afterAutospacing="0"/>
+        <w:ind w:firstLine="357"/>
       </w:pPr>
+      <w:r>
+        <w:t xml:space="preserve">No contexto da disciplina de </w:t>
+      </w:r>
+      <w:r>
+        <w:rPr>
+          <w:rStyle w:val="Forte"/>
+        </w:rPr>
+        <w:t>Laboratório de Programação I</w:t>
+      </w:r>
+      <w:r>
+        <w:t xml:space="preserve">, o estudo da linguagem </w:t>
+      </w:r>
+      <w:r>
+        <w:rPr>
+          <w:rStyle w:val="Forte"/>
+        </w:rPr>
+        <w:t>Python</w:t>
+      </w:r>
+      <w:r>
+        <w:t xml:space="preserve"> tem como objetivo desenvolver a compreensão dos fundamentos da programação e de sua aplicação prática na resolução de problemas computacionais. A ementa da disciplina contempla o funcionamento geral da sintaxe básica da linguagem, abrangendo estruturas de controle, variáveis, tipos de dados, operadores, funções e manipulação de estruturas como listas, dicionários e tabelas. Esses elementos constituem a base necessária para a construção de programas capazes de organizar, processar e interpretar informações de forma estruturada.</w:t>
+      </w:r>
+    </w:p>
+    <w:p>
+      <w:pPr>
+        <w:pStyle w:val="NormalWeb"/>
+        <w:spacing w:before="0" w:beforeAutospacing="0" w:after="120" w:afterAutospacing="0"/>
+        <w:ind w:firstLine="357"/>
+      </w:pPr>
+      <w:r>
+        <w:t>Além do domínio da sintaxe fundamental, a disciplina também introduz o uso de bibliotecas amplamente empregadas no ecossistema de desenvolvimento em Python. A integração entre os fundamentos da linguagem e essas bibliotecas amplia significativamente as possibilidades de análise e automação, permitindo que conceitos introdutórios de programação sejam conectados a aplicações concretas em contextos acadêmicos e profissionais.</w:t>
+      </w:r>
+    </w:p>
+    <w:p>
+      <w:pPr>
+        <w:pStyle w:val="NormalWeb"/>
+        <w:spacing w:before="0" w:beforeAutospacing="0" w:after="120" w:afterAutospacing="0"/>
+        <w:ind w:firstLine="357"/>
+      </w:pPr>
+      <w:r>
+        <w:t xml:space="preserve">Nesse sentido, o presente trabalho articula os conhecimentos desenvolvidos na disciplina com uma aplicação prática orientada ao contexto de análise de dados. A partir da utilização de Python e de suas bibliotecas de manipulação e análise estatística, foi possível explorar informações provenientes do data </w:t>
+      </w:r>
+      <w:r>
+        <w:t>Warehouse</w:t>
+      </w:r>
+      <w:r>
+        <w:t xml:space="preserve"> do sistema de controle de estoque da MFix, demonstrando como os fundamentos de programação podem ser empregados na construção de soluções analíticas voltadas à interpretação de dados e ao apoio à tomada de decisão.</w:t>
+      </w:r>
+    </w:p>
+    <w:p>
+      <w:pPr>
+        <w:pStyle w:val="NormalWeb"/>
+        <w:spacing w:before="0" w:beforeAutospacing="0" w:after="120" w:afterAutospacing="0"/>
+        <w:ind w:firstLine="357"/>
+      </w:pPr>
+      <w:r>
+        <w:t xml:space="preserve">No presente estudo, utilizou-se como base analítica o </w:t>
+      </w:r>
+      <w:r>
+        <w:t>D</w:t>
+      </w:r>
+      <w:r>
+        <w:t xml:space="preserve">ata </w:t>
+      </w:r>
+      <w:r>
+        <w:t>Warehouse</w:t>
+      </w:r>
+      <w:r>
+        <w:t xml:space="preserve"> desenvolvido para o sistema de controle de estoque da empresa MFix. A modelagem adotada possui como núcleo a tabela fato `fato_movimentacao`, estruturada para registrar eventos operacionais de movimentação de estoque e composta por medidas quantitativas e monetárias, além de chaves de relacionamento com as dimensões de produto, tempo, tipo de movimentação, fornecedor, transportadora e lote. Essa organização dimensional permitiu que os dados históricos já integrados pelo processo de ETL fossem empregados como fonte </w:t>
+      </w:r>
+      <w:r>
+        <w:lastRenderedPageBreak/>
+        <w:t>consistente para análise estatística inferencial, sem necessidade de intervenções adicionais na etapa de carga ou transformação.</w:t>
+      </w:r>
+    </w:p>
+    <w:p>
+      <w:pPr>
+        <w:pStyle w:val="NormalWeb"/>
+        <w:spacing w:before="0" w:beforeAutospacing="0" w:after="120" w:afterAutospacing="0"/>
+        <w:ind w:firstLine="357"/>
+      </w:pPr>
+      <w:r>
+        <w:t>A partir da estrutura da tabela fato, foram identificadas as medidas `quantidade` e `valor_total`. Embora ambas apresentem natureza numérica, optou-se pela construção de uma nova variável contínua denominada valor unitário, obtida pela razão entre o valor total da movimentação e a respectiva quantidade movimentada. Essa escolha foi adotada porque a utilização isolada do valor total poderia introduzir distorções decorrentes da variação no tamanho dos lotes movimentados. Em operações de estoque, movimentações com quantidades muito distintas podem apresentar valores totais proporcionalmente diferentes sem necessariamente refletir alteração no comportamento do preço unitário. Dessa forma, o valor unitário foi considerado mais adequado para representar o fenômeno econômico de interesse e permitir comparabilidade estatística entre os registros.</w:t>
+      </w:r>
+    </w:p>
+    <w:p>
+      <w:pPr>
+        <w:pStyle w:val="NormalWeb"/>
+        <w:spacing w:before="0" w:beforeAutospacing="0" w:after="120" w:afterAutospacing="0"/>
+        <w:ind w:firstLine="357"/>
+      </w:pPr>
+      <w:r>
+        <w:t xml:space="preserve">Para a composição da população estatística, foram selecionados todos os registros válidos da tabela `fato_movimentacao` que apresentavam valores positivos para quantidade e valor total. Essa filtragem teve como objetivo excluir observações nulas, inconsistentes ou sem significado analítico, assegurando maior robustez à análise. Após a aplicação desses critérios, a população foi composta por </w:t>
+      </w:r>
+      <w:r>
+        <w:rPr>
+          <w:b/>
+          <w:bCs/>
+        </w:rPr>
+        <w:t>200 observações</w:t>
+      </w:r>
+      <w:r>
+        <w:t xml:space="preserve">, consideradas representativas do histórico disponível no </w:t>
+      </w:r>
+      <w:r>
+        <w:t>D</w:t>
+      </w:r>
+      <w:r>
+        <w:t xml:space="preserve">ata </w:t>
+      </w:r>
+      <w:r>
+        <w:t>Warehouse</w:t>
+      </w:r>
+      <w:r>
+        <w:t xml:space="preserve"> para a variável estudada.</w:t>
+      </w:r>
+    </w:p>
+    <w:p>
+      <w:pPr>
+        <w:pStyle w:val="NormalWeb"/>
+        <w:spacing w:before="0" w:beforeAutospacing="0" w:after="120" w:afterAutospacing="0"/>
+        <w:ind w:firstLine="357"/>
+      </w:pPr>
+      <w:r>
+        <w:t xml:space="preserve">Em seguida, procedeu-se à determinação do tamanho amostral com </w:t>
+      </w:r>
+      <w:r>
+        <w:rPr>
+          <w:b/>
+          <w:bCs/>
+        </w:rPr>
+        <w:t>nível de confiança de 95%.</w:t>
+      </w:r>
+      <w:r>
+        <w:t xml:space="preserve"> Para esse cálculo, utilizou-se o valor crítico da distribuição normal correspondente a 1,96, o desvio padrão estimado da população e a correção para população finita. O emprego desse procedimento teve por finalidade estimar o número mínimo de observações necessário para representar adequadamente a população dentro de um nível conhecido de confiança estatística. O resultado obtido indicou necessidade de </w:t>
+      </w:r>
+      <w:r>
+        <w:rPr>
+          <w:b/>
+          <w:bCs/>
+        </w:rPr>
+        <w:t>200 observações</w:t>
+      </w:r>
+      <w:r>
+        <w:t>, valor equivalente ao tamanho total da população disponível. Desse modo, a análise assumiu caráter próximo de um censo estatístico, uma vez que praticamente todos os registros válidos foram incorporados ao estudo.</w:t>
+      </w:r>
+    </w:p>
+    <w:p>
+      <w:pPr>
+        <w:pStyle w:val="NormalWeb"/>
+        <w:spacing w:before="0" w:beforeAutospacing="0" w:after="120" w:afterAutospacing="0"/>
+        <w:ind w:firstLine="357"/>
+      </w:pPr>
+      <w:r>
+        <w:t xml:space="preserve">A partir da amostra obtida, foram calculadas as estatísticas descritivas da variável `valor_unitario`. A média amostral observada foi de </w:t>
+      </w:r>
+      <w:r>
+        <w:rPr>
+          <w:b/>
+          <w:bCs/>
+        </w:rPr>
+        <w:t>134,24</w:t>
+      </w:r>
+      <w:r>
+        <w:t xml:space="preserve">, enquanto o desvio padrão foi de </w:t>
+      </w:r>
+      <w:r>
+        <w:rPr>
+          <w:b/>
+          <w:bCs/>
+        </w:rPr>
+        <w:t>378,79</w:t>
+      </w:r>
+      <w:r>
+        <w:t>. A análise dos quartis mostrou que 25% das observações apresentaram valores inferiores a 12,19</w:t>
+      </w:r>
+      <w:r>
+        <w:t xml:space="preserve">, </w:t>
+      </w:r>
+      <w:r>
+        <w:t xml:space="preserve">50% inferiores a 18,74 e 75% inferiores a 97,81. O valor mínimo identificado foi 0,25, enquanto o valor máximo atingiu 4248,75. A diferença expressiva entre média e mediana, associada à elevada amplitude observada, indica que a distribuição da variável apresenta </w:t>
+      </w:r>
+      <w:r>
+        <w:rPr>
+          <w:b/>
+          <w:bCs/>
+        </w:rPr>
+        <w:t>assimetria positiva acentuada</w:t>
+      </w:r>
+      <w:r>
+        <w:t>, caracterizada pela presença de poucos valores extremos elevados que exercem influência relevante sobre a média amostral.</w:t>
+      </w:r>
+    </w:p>
+    <w:p>
+      <w:pPr>
+        <w:pStyle w:val="NormalWeb"/>
+        <w:spacing w:before="0" w:beforeAutospacing="0" w:after="120" w:afterAutospacing="0"/>
+        <w:ind w:firstLine="357"/>
+      </w:pPr>
+      <w:r>
+        <w:t>Com base nesses resultados, estimou-se o intervalo de confiança de 95% para a média populacional, obtendo-se o intervalo compreendido entre 81,42 e 187,05. O uso do intervalo de confiança foi importante porque permitiu estimar uma faixa de valores plausíveis para a média populacional, em vez de se restringir a um único valor pontual. A amplitude relativamente elevada desse intervalo é coerente com a elevada dispersão observada nos dados e com a presença de valores extremos que ampliam a variabilidade da distribuição.</w:t>
+      </w:r>
+    </w:p>
+    <w:p>
+      <w:pPr>
+        <w:pStyle w:val="NormalWeb"/>
+        <w:spacing w:before="0" w:beforeAutospacing="0" w:after="120" w:afterAutospacing="0"/>
+        <w:ind w:firstLine="357"/>
+      </w:pPr>
+      <w:r>
+        <w:t xml:space="preserve">Na etapa de inferência estatística, foi realizado um </w:t>
+      </w:r>
+      <w:r>
+        <w:rPr>
+          <w:b/>
+          <w:bCs/>
+        </w:rPr>
+        <w:t>teste t para uma amostra</w:t>
+      </w:r>
+      <w:r>
+        <w:t xml:space="preserve">, adotando-se como hipótese nula a igualdade entre a média populacional do valor unitário e o valor de referência de </w:t>
+      </w:r>
+      <w:r>
+        <w:rPr>
+          <w:b/>
+          <w:bCs/>
+        </w:rPr>
+        <w:t>90.</w:t>
+      </w:r>
+      <w:r>
+        <w:t xml:space="preserve"> Formalmente, estabeleceu-se (H_0: \mu = 90) e (H_1: \mu \neq 90). A escolha desse valor de referência foi considerada metodologicamente plausível por situar-se dentro do intervalo de confiança obtido e por representar um patamar compatível com a dispersão observada nos dados. O teste produziu </w:t>
+      </w:r>
+      <w:r>
+        <w:rPr>
+          <w:b/>
+          <w:bCs/>
+        </w:rPr>
+        <w:t>estatística (t = 1{,}6516) e p-valor = 0,1002.</w:t>
+      </w:r>
+    </w:p>
+    <w:p>
+      <w:pPr>
+        <w:pStyle w:val="NormalWeb"/>
+        <w:spacing w:before="0" w:beforeAutospacing="0" w:after="120" w:afterAutospacing="0"/>
+        <w:ind w:firstLine="357"/>
+      </w:pPr>
+      <w:r>
+        <w:t xml:space="preserve">Considerando-se nível de significância de 5%, o p-valor encontrado é superior a 0,05. Dessa forma, </w:t>
+      </w:r>
+      <w:r>
+        <w:rPr>
+          <w:b/>
+          <w:bCs/>
+        </w:rPr>
+        <w:t>não foram encontradas evidências estatísticas suficientes para rejeitar a hipótese nula</w:t>
+      </w:r>
+      <w:r>
+        <w:t xml:space="preserve">. Em termos </w:t>
+      </w:r>
+      <w:r>
+        <w:lastRenderedPageBreak/>
+        <w:t xml:space="preserve">analíticos, isso significa que, com base nos dados observados, não se pode afirmar que a média populacional do valor unitário seja estatisticamente diferente de 90. Esse resultado é consistente com o intervalo de confiança estimado, uma vez que o valor de referência adotado </w:t>
+      </w:r>
+      <w:r>
+        <w:t>se encontra</w:t>
+      </w:r>
+      <w:r>
+        <w:t xml:space="preserve"> contido no intervalo calculado.</w:t>
+      </w:r>
+    </w:p>
+    <w:p>
+      <w:pPr>
+        <w:pStyle w:val="NormalWeb"/>
+        <w:spacing w:before="0" w:beforeAutospacing="0" w:after="120" w:afterAutospacing="0"/>
+        <w:ind w:firstLine="357"/>
+      </w:pPr>
+      <w:r>
+        <w:t xml:space="preserve">Em síntese, a aplicação de técnicas de estatística inferencial sobre o data </w:t>
+      </w:r>
+      <w:r>
+        <w:t>Warehouse</w:t>
+      </w:r>
+      <w:r>
+        <w:t xml:space="preserve"> da MFix demonstrou que a infraestrutura analítica previamente construída pelo projeto permitiu não apenas o armazenamento e integração de dados operacionais, mas também sua utilização em procedimentos quantitativos de apoio à análise gerencial. A construção da variável valor unitário mostrou-se adequada para neutralizar efeitos de escala associados às quantidades movimentadas, enquanto a análise estatística evidenciou elevada heterogeneidade entre as movimentações registradas. Dessa forma, o estudo confirma que o ambiente de data </w:t>
+      </w:r>
+      <w:r>
+        <w:t>Warehouse</w:t>
+      </w:r>
+      <w:r>
+        <w:t xml:space="preserve"> desenvolvido constitui uma base consistente para exploração analítica, interpretação estatística e apoio à tomada de decisão no contexto do controle de estoque empresarial.</w:t>
+      </w:r>
     </w:p>
     <w:p>
       <w:pPr>
@@ -21716,7 +21778,6 @@
       <w:lvlJc w:val="left"/>
       <w:pPr>
         <w:ind w:left="105" w:hanging="220"/>
-        <w:jc w:val="left"/>
       </w:pPr>
       <w:rPr>
         <w:rFonts w:ascii="Arial MT" w:eastAsia="Arial MT" w:hAnsi="Arial MT" w:cs="Arial MT" w:hint="default"/>
@@ -21969,7 +22030,6 @@
       <w:lvlJc w:val="left"/>
       <w:pPr>
         <w:ind w:left="105" w:hanging="221"/>
-        <w:jc w:val="left"/>
       </w:pPr>
       <w:rPr>
         <w:rFonts w:ascii="Arial MT" w:eastAsia="Arial MT" w:hAnsi="Arial MT" w:cs="Arial MT" w:hint="default"/>
@@ -22100,7 +22160,6 @@
       <w:lvlJc w:val="left"/>
       <w:pPr>
         <w:ind w:left="786" w:hanging="426"/>
-        <w:jc w:val="left"/>
       </w:pPr>
       <w:rPr>
         <w:rFonts w:ascii="Times New Roman" w:eastAsia="Times New Roman" w:hAnsi="Times New Roman" w:cs="Times New Roman" w:hint="default"/>
@@ -22122,7 +22181,6 @@
       <w:lvlJc w:val="left"/>
       <w:pPr>
         <w:ind w:left="1361" w:hanging="570"/>
-        <w:jc w:val="left"/>
       </w:pPr>
       <w:rPr>
         <w:rFonts w:ascii="Times New Roman" w:eastAsia="Times New Roman" w:hAnsi="Times New Roman" w:cs="Times New Roman" w:hint="default"/>
@@ -22233,7 +22291,6 @@
       <w:lvlJc w:val="left"/>
       <w:pPr>
         <w:ind w:left="645" w:hanging="285"/>
-        <w:jc w:val="left"/>
       </w:pPr>
       <w:rPr>
         <w:rFonts w:ascii="Arial" w:eastAsia="Arial" w:hAnsi="Arial" w:cs="Arial" w:hint="default"/>
@@ -22255,7 +22312,6 @@
       <w:lvlJc w:val="left"/>
       <w:pPr>
         <w:ind w:left="1081" w:hanging="721"/>
-        <w:jc w:val="left"/>
       </w:pPr>
       <w:rPr>
         <w:rFonts w:ascii="Arial" w:eastAsia="Arial" w:hAnsi="Arial" w:cs="Arial" w:hint="default"/>
@@ -23096,6 +23152,37 @@
       <w:ind w:left="105"/>
     </w:pPr>
   </w:style>
+  <w:style w:type="paragraph" w:styleId="NormalWeb">
+    <w:name w:val="Normal (Web)"/>
+    <w:basedOn w:val="Normal"/>
+    <w:uiPriority w:val="99"/>
+    <w:semiHidden/>
+    <w:unhideWhenUsed/>
+    <w:rsid w:val="00C35771"/>
+    <w:pPr>
+      <w:widowControl/>
+      <w:autoSpaceDE/>
+      <w:autoSpaceDN/>
+      <w:spacing w:before="100" w:beforeAutospacing="1" w:after="100" w:afterAutospacing="1"/>
+    </w:pPr>
+    <w:rPr>
+      <w:rFonts w:ascii="Times New Roman" w:eastAsia="Times New Roman" w:hAnsi="Times New Roman" w:cs="Times New Roman"/>
+      <w:sz w:val="24"/>
+      <w:szCs w:val="24"/>
+      <w:lang w:val="pt-BR" w:eastAsia="pt-BR"/>
+    </w:rPr>
+  </w:style>
+  <w:style w:type="character" w:styleId="Forte">
+    <w:name w:val="Strong"/>
+    <w:basedOn w:val="Fontepargpadro"/>
+    <w:uiPriority w:val="22"/>
+    <w:qFormat/>
+    <w:rsid w:val="00C35771"/>
+    <w:rPr>
+      <w:b/>
+      <w:bCs/>
+    </w:rPr>
+  </w:style>
 </w:styles>
 </file>
 

</xml_diff>